<commit_message>
Add Phase 6 checklist; update CV files with portal URL
- docs/PHASE_6_OUTSTANDING_ISSUES.md: Phase 6 outstanding issues tracker
- public/cv/Tigran_Atoyan.pdf: updated with portal URL in header
- public/cv/Tigran_Atoyan.docx: updated with portal URL in header

Co-authored-by: Copilot <223556219+Copilot@users.noreply.github.com>
</commit_message>
<xml_diff>
--- a/public/cv/Tigran_Atoyan.docx
+++ b/public/cv/Tigran_Atoyan.docx
@@ -39,7 +39,48 @@
         <w:rPr>
           <w:sz w:val="16"/>
         </w:rPr>
-        <w:t>Yerevan, Armenia · +374 94 905557 · Tigran.atoyan80@gmail.com · LinkedIn: tigran-atoyan-19533a3 · GitHub: breadcost-app / The.Director</w:t>
+        <w:t>Yerevan, Armenia · +374 94 905557 · Tigran.atoyan80@gmail.com · LinkedIn: tigran-atoyan-19533a3 ·</w:t>
+      </w:r>
+      <w:r>
+        <w:t xml:space="preserve"> </w:t>
+      </w:r>
+      <w:r>
+        <w:rPr>
+          <w:sz w:val="16"/>
+        </w:rPr>
+        <w:t>https://tigranatoyan-ai-portal.vercel.app/</w:t>
+      </w:r>
+      <w:r>
+        <w:rPr>
+          <w:sz w:val="16"/>
+        </w:rPr>
+        <w:t xml:space="preserve"> </w:t>
+      </w:r>
+      <w:r>
+        <w:rPr>
+          <w:sz w:val="16"/>
+        </w:rPr>
+        <w:t>·</w:t>
+      </w:r>
+      <w:r>
+        <w:rPr>
+          <w:sz w:val="16"/>
+        </w:rPr>
+        <w:t xml:space="preserve"> GitHub: </w:t>
+      </w:r>
+      <w:proofErr w:type="spellStart"/>
+      <w:r>
+        <w:rPr>
+          <w:sz w:val="16"/>
+        </w:rPr>
+        <w:t>breadcost</w:t>
+      </w:r>
+      <w:proofErr w:type="spellEnd"/>
+      <w:r>
+        <w:rPr>
+          <w:sz w:val="16"/>
+        </w:rPr>
+        <w:t>-app / The.Director</w:t>
       </w:r>
     </w:p>
     <w:p>
@@ -89,10 +130,7 @@
         <w:spacing w:line="247" w:lineRule="auto"/>
       </w:pPr>
       <w:r>
-        <w:t>Senior delivery, product, and operations leader with 15+ years of experience turning ambiguous business problems into governed systems, dashboards, workflows, and shipping software. Combines enterprise delivery leadership with hands-on AI-assisted building: prompt-driven requirements, architecture packs, Jira-ready stories, Copilot/Claude/Cursor workflows, reporting portals, CRM automations, and full-stack prototypes. Proven operator across regulated healthcare/life sciences, gaming/media, professional serv</w:t>
-      </w:r>
-      <w:r>
-        <w:t>ices, and owner-operated bakery operations, with a record of improving on-time delivery from approx. 30% to approx. 90%, reducing lead/cycle time from months/weeks to approx. 1 week, and building transparent KPI cadences that executives and customers can actually use.</w:t>
+        <w:t>Senior delivery, product, and operations leader with 15+ years of experience turning ambiguous business problems into governed systems, dashboards, workflows, and shipping software. Combines enterprise delivery leadership with hands-on AI-assisted building: prompt-driven requirements, architecture packs, Jira-ready stories, Copilot/Claude/Cursor workflows, reporting portals, CRM automations, and full-stack prototypes. Proven operator across regulated healthcare/life sciences, gaming/media, professional services, and owner-operated bakery operations, with a record of improving on-time delivery from approx. 30% to approx. 90%, reducing lead/cycle time from months/weeks to approx. 1 week, and building transparent KPI cadences that executives and customers can actually use.</w:t>
       </w:r>
     </w:p>
     <w:p>
@@ -362,6 +400,7 @@
         <w:ind w:left="259" w:hanging="173"/>
       </w:pPr>
       <w:r>
+        <w:lastRenderedPageBreak/>
         <w:t>Lead multi-stream delivery coordination across data, data platform, cloud, and applications, aligning requirements, capacity, prioritization, implementation, and customer-facing communication.</w:t>
       </w:r>
     </w:p>
@@ -372,7 +411,6 @@
         <w:ind w:left="259" w:hanging="173"/>
       </w:pPr>
       <w:r>
-        <w:lastRenderedPageBreak/>
         <w:t>Designed AI-supported delivery processes to reduce ambiguity in prioritization, capacity planning, reporting, and decision-making across distributed teams.</w:t>
       </w:r>
     </w:p>
@@ -737,6 +775,7 @@
           <w:color w:val="000000"/>
           <w:sz w:val="20"/>
         </w:rPr>
+        <w:lastRenderedPageBreak/>
         <w:t>Director of Accounts, Project Management &amp; Business Development - RedKite</w:t>
       </w:r>
       <w:r>
@@ -767,7 +806,6 @@
         <w:ind w:left="259" w:hanging="173"/>
       </w:pPr>
       <w:r>
-        <w:lastRenderedPageBreak/>
         <w:t>Led multi-client delivery across product squads; improved on-time delivery and sprint predictability from approx. 30% to approx. 90%.</w:t>
       </w:r>
     </w:p>

</xml_diff>